<commit_message>
Add Zenodo DOI to manuscript and repository metadata
</commit_message>
<xml_diff>
--- a/manuscript/CEUS_title_page_final.docx
+++ b/manuscript/CEUS_title_page_final.docx
@@ -35,12 +35,12 @@
     </w:p>
     <w:p>
       <w:r>
-        <w:t>Data availability: The code and derived analytical outputs supporting this study will be made publicly available in a citable online repository upon acceptance. Some underlying source datasets are subject to third-party licensing or redistribution constraints; where redistribution is restricted, metadata, provenance, and instructions for re-accessing the original sources will be provided.</w:t>
+        <w:t>Data availability: The code and derived analytical outputs supporting this study are available at https://doi.org/10.5281/zenodo.19137721. Some underlying source datasets are subject to third-party licensing or redistribution constraints; where redistribution is restricted, the repository provides metadata, provenance, and instructions for re-accessing the original sources.</w:t>
       </w:r>
     </w:p>
     <w:p>
       <w:r>
-        <w:t>Code availability: The scripts required to reproduce the main analytical outputs and figures will be made publicly available in the same citable repository upon acceptance.</w:t>
+        <w:t>Code availability: The scripts required to reproduce the main analytical outputs and figures are available at https://doi.org/10.5281/zenodo.19137721.</w:t>
       </w:r>
     </w:p>
     <w:p>

</xml_diff>